<commit_message>
fix(templates): the fire-safety layout review, second round: decision 7's first aid prints its burns, gas and electrocution dashes like the rest, decisions 5, 6, 8 and 9 spaced like 1 to 4, dashes as en dashes in decisions 2, 5 and 8, the acknowledgement alike in every decision with the representative's name bold, IPSU art. 241's dashes under their letter, dashes hung in table cells, an article's numbered paragraphs evenly spaced, the training themes' staff blocks kept with their plan, the covers' lists hung from their numbers, "m²" in one form in the means list, the posted sheet's title block evenly spaced, and room under the registers' tables
</commit_message>
<xml_diff>
--- a/packages/document-engine/templates/fire/1.0_fire_cover_decisions.docx
+++ b/packages/document-engine/templates/fire/1.0_fire_cover_decisions.docx
@@ -134,7 +134,9 @@
           <w:sz w:val="20"/>
           <w:lang w:val="ro-RO"/>
         </w:rPr>
-        <w:t>1. Modul de organizare și responsabilitățile privind apărarea împotriva incendiilor;</w:t>
+        <w:t>1.</w:t>
+        <w:tab/>
+        <w:t>Modul de organizare și responsabilitățile privind apărarea împotriva incendiilor;</w:t>
       </w:r>
     </w:p>
     <w:p>
@@ -161,7 +163,9 @@
           <w:sz w:val="20"/>
           <w:lang w:val="ro-RO"/>
         </w:rPr>
-        <w:t>2. Măsurile obligatorii privind instruirea salariaților în domeniul situațiilor de urgență;</w:t>
+        <w:t>2.</w:t>
+        <w:tab/>
+        <w:t>Măsurile obligatorii privind instruirea salariaților în domeniul situațiilor de urgență;</w:t>
       </w:r>
     </w:p>
     <w:p>
@@ -188,7 +192,9 @@
           <w:sz w:val="20"/>
           <w:lang w:val="ro-RO"/>
         </w:rPr>
-        <w:t>3. Modul de reglementare a lucrărilor cu foc deschis;</w:t>
+        <w:t>3.</w:t>
+        <w:tab/>
+        <w:t>Modul de reglementare a lucrărilor cu foc deschis;</w:t>
       </w:r>
     </w:p>
     <w:p>
@@ -215,7 +221,9 @@
           <w:sz w:val="20"/>
           <w:lang w:val="ro-RO"/>
         </w:rPr>
-        <w:t>4. Modul de reglementare a fumatului;</w:t>
+        <w:t>4.</w:t>
+        <w:tab/>
+        <w:t>Modul de reglementare a fumatului;</w:t>
       </w:r>
     </w:p>
     <w:p>
@@ -242,7 +250,9 @@
           <w:sz w:val="20"/>
           <w:lang w:val="ro-RO"/>
         </w:rPr>
-        <w:t>5. Modul de reglementare a lucrărilor în timpul sezonului rece și în perioadele caniculare și secetoase;</w:t>
+        <w:t>5.</w:t>
+        <w:tab/>
+        <w:t>Modul de reglementare a lucrărilor în timpul sezonului rece și în perioadele caniculare și secetoase;</w:t>
       </w:r>
     </w:p>
     <w:p>
@@ -269,7 +279,9 @@
           <w:sz w:val="20"/>
           <w:lang w:val="ro-RO"/>
         </w:rPr>
-        <w:t>6. Numirea cadrului tehnic cu atribuții în domeniul apărării împotriva incendiilor;</w:t>
+        <w:t>6.</w:t>
+        <w:tab/>
+        <w:t>Numirea cadrului tehnic cu atribuții în domeniul apărării împotriva incendiilor;</w:t>
       </w:r>
     </w:p>
     <w:p>
@@ -296,7 +308,9 @@
           <w:sz w:val="20"/>
           <w:lang w:val="ro-RO"/>
         </w:rPr>
-        <w:t>7. Instrucțiunile de apărare împotriva incendiilor și atribuțiile salariaților la locurile de muncă;</w:t>
+        <w:t>7.</w:t>
+        <w:tab/>
+        <w:t>Instrucțiunile de apărare împotriva incendiilor și atribuțiile salariaților la locurile de muncă;</w:t>
       </w:r>
     </w:p>
     <w:p>
@@ -323,7 +337,9 @@
           <w:sz w:val="20"/>
           <w:lang w:val="ro-RO"/>
         </w:rPr>
-        <w:t>8. Modul de colectare a deșeurilor, reziduurilor și ambalajelor combustibile, precum și distrugerea acestora;</w:t>
+        <w:t>8.</w:t>
+        <w:tab/>
+        <w:t>Modul de colectare a deșeurilor, reziduurilor și ambalajelor combustibile, precum și distrugerea acestora;</w:t>
       </w:r>
     </w:p>
     <w:p>
@@ -350,7 +366,9 @@
           <w:sz w:val="20"/>
           <w:lang w:val="ro-RO"/>
         </w:rPr>
-        <w:t>9. Controlul propriu al respectării normelor, dispozițiilor și măsurilor de apărare împotriva incendiilor.</w:t>
+        <w:t>9.</w:t>
+        <w:tab/>
+        <w:t>Controlul propriu al respectării normelor, dispozițiilor și măsurilor de apărare împotriva incendiilor.</w:t>
       </w:r>
     </w:p>
     <w:p>
@@ -797,7 +815,7 @@
       <w:pStyle w:val="Footer"/>
       <w:bidi w:val="0"/>
       <w:spacing w:before="60" w:after="0"/>
-      <w:ind w:hanging="0" w:left="0"/>
+      <w:ind w:hanging="0" w:left="0" w:right="0"/>
       <w:jc w:val="center"/>
       <w:rPr>
         <w:rFonts w:ascii="Arial" w:hAnsi="Arial"/>

</xml_diff>

<commit_message>
fix(templates): a language pass over the fire-safety set: "art." in lower case mid-sentence and in the "Preluare din" markers, ranges with an unspaced en dash, the acknowledgement as "Proces-verbal de luare de cunoștință" with "Nr. crt.", the covers' "Am luat cunoștință" and "predare-primire", job titles, the representative's role and a workplace's activity in lower case inside a sentence, decision 2's broken sentences and agreement mended, the IPSU's own articles worded more clearly ("conductoarele", "din cauza", "SUNT INTERZISE"), the training themes' "Durata" and "PERIODICITATE: LA 3 LUNI", the tests titled "Test de verificare" with their questions mended and keys in lower-case letters, and the first aid copied anew from the own instructions; nothing a document requires changes
</commit_message>
<xml_diff>
--- a/packages/document-engine/templates/fire/1.0_fire_cover_decisions.docx
+++ b/packages/document-engine/templates/fire/1.0_fire_cover_decisions.docx
@@ -339,7 +339,7 @@
         </w:rPr>
         <w:t>8.</w:t>
         <w:tab/>
-        <w:t>Modul de colectare a deșeurilor, reziduurilor și ambalajelor combustibile, precum și distrugerea acestora;</w:t>
+        <w:t>Modul de colectare a deșeurilor, reziduurilor și ambalajelor combustibile, precum și de distrugere a acestora;</w:t>
       </w:r>
     </w:p>
     <w:p>
@@ -395,7 +395,7 @@
           <w:sz w:val="20"/>
           <w:lang w:val="ro-RO"/>
         </w:rPr>
-        <w:t>PERSOANE IMPLICATE ÎN PROCESUL DE PREDARE / PRIMIRE A DOCUMENTULUI</w:t>
+        <w:t>PERSOANE IMPLICATE ÎN PROCESUL DE PREDARE-PRIMIRE A DOCUMENTULUI</w:t>
       </w:r>
     </w:p>
     <w:tbl>
@@ -446,7 +446,7 @@
                 <w:sz w:val="20"/>
                 <w:lang w:val="ro-RO"/>
               </w:rPr>
-              <w:t>Am luat la cunoștință</w:t>
+              <w:t>Am luat cunoștință</w:t>
             </w:r>
           </w:p>
           <w:p>

</xml_diff>